<commit_message>
docs(report): embed high-res vector graphic for figure 1.2 MLOps lifecycle
</commit_message>
<xml_diff>
--- a/docs/BAO_CAO_DO_AN_MLOPS_CHINH_THUC.docx
+++ b/docs/BAO_CAO_DO_AN_MLOPS_CHINH_THUC.docx
@@ -1,6 +1,6 @@
 
 <file path=word/document.xml><?xml version="1.0" encoding="utf-8"?>
-<w:document xmlns:w="http://schemas.openxmlformats.org/wordprocessingml/2006/main">
+<w:document xmlns:w="http://schemas.openxmlformats.org/wordprocessingml/2006/main" xmlns:r="http://schemas.openxmlformats.org/officeDocument/2006/relationships" xmlns:wp="http://schemas.openxmlformats.org/drawingml/2006/wordprocessingDrawing" xmlns:a="http://schemas.openxmlformats.org/drawingml/2006/main" xmlns:pic="http://schemas.openxmlformats.org/drawingml/2006/picture">
   <w:body>
     <w:p>
       <w:pPr>
@@ -4897,104 +4897,44 @@
     <w:p>
       <w:pPr>
         <w:jc w:val="center"/>
-        <w:spacing w:line="240" w:lineRule="auto" w:before="60" w:after="60"/>
-        <w:shd w:val="clear" w:color="auto" w:fill="F8F9FA"/>
-        <w:pBdr>
-          <w:top w:val="single" w:sz="6" w:space="8" w:color="D0D7DE"/>
-          <w:bottom w:val="single" w:sz="6" w:space="8" w:color="D0D7DE"/>
-          <w:left w:val="single" w:sz="6" w:space="8" w:color="D0D7DE"/>
-          <w:right w:val="single" w:sz="6" w:space="8" w:color="D0D7DE"/>
-        </w:pBdr>
-      </w:pPr>
-      <w:r>
-        <w:rPr>
-          <w:sz w:val="18"/>
-          <w:rFonts w:ascii="Consolas" w:hAnsi="Consolas"/>
-          <w:color w:val="0969DA"/>
-        </w:rPr>
-        <w:t xml:space="preserve">+-------------------------------------------------------------------------+</w:t>
-        <w:br/>
-      </w:r>
-      <w:r>
-        <w:rPr>
-          <w:sz w:val="18"/>
-          <w:rFonts w:ascii="Consolas" w:hAnsi="Consolas"/>
-          <w:color w:val="0969DA"/>
-        </w:rPr>
-        <w:t xml:space="preserve">|                 CHU TRÌNH VÒNG ĐỜI MLOPS KHÉP KÍN                       |</w:t>
-        <w:br/>
-      </w:r>
-      <w:r>
-        <w:rPr>
-          <w:sz w:val="18"/>
-          <w:rFonts w:ascii="Consolas" w:hAnsi="Consolas"/>
-          <w:color w:val="0969DA"/>
-        </w:rPr>
-        <w:t xml:space="preserve">+-------------------------------------------------------------------------+</w:t>
-        <w:br/>
-      </w:r>
-      <w:r>
-        <w:rPr>
-          <w:sz w:val="18"/>
-          <w:rFonts w:ascii="Consolas" w:hAnsi="Consolas"/>
-          <w:color w:val="0969DA"/>
-        </w:rPr>
-        <w:t xml:space="preserve">| [1. Data Pipeline]  ---&gt;  [2. Model Training]  ---&gt;  [3. Tracking Server]|</w:t>
-        <w:br/>
-      </w:r>
-      <w:r>
-        <w:rPr>
-          <w:sz w:val="18"/>
-          <w:rFonts w:ascii="Consolas" w:hAnsi="Consolas"/>
-          <w:color w:val="0969DA"/>
-        </w:rPr>
-        <w:t xml:space="preserve">| Raw Data &amp; Labels         Hyperparameter Tuning      MLflow + Postgres   |</w:t>
-        <w:br/>
-      </w:r>
-      <w:r>
-        <w:rPr>
-          <w:sz w:val="18"/>
-          <w:rFonts w:ascii="Consolas" w:hAnsi="Consolas"/>
-          <w:color w:val="0969DA"/>
-        </w:rPr>
-        <w:t xml:space="preserve">|         |                         |                          |          |</w:t>
-        <w:br/>
-      </w:r>
-      <w:r>
-        <w:rPr>
-          <w:sz w:val="18"/>
-          <w:rFonts w:ascii="Consolas" w:hAnsi="Consolas"/>
-          <w:color w:val="0969DA"/>
-        </w:rPr>
-        <w:t xml:space="preserve">|         v                         v                          v          |</w:t>
-        <w:br/>
-      </w:r>
-      <w:r>
-        <w:rPr>
-          <w:sz w:val="18"/>
-          <w:rFonts w:ascii="Consolas" w:hAnsi="Consolas"/>
-          <w:color w:val="0969DA"/>
-        </w:rPr>
-        <w:t xml:space="preserve">| [6. Telemetry &amp; Alert]&lt;-- [5. Model Serving]   &lt;---  [4. Artifact Store] |</w:t>
-        <w:br/>
-      </w:r>
-      <w:r>
-        <w:rPr>
-          <w:sz w:val="18"/>
-          <w:rFonts w:ascii="Consolas" w:hAnsi="Consolas"/>
-          <w:color w:val="0969DA"/>
-        </w:rPr>
-        <w:t xml:space="preserve">| Prometheus + Grafana      FastAPI OCR Service        MinIO S3 Buckets   |</w:t>
-        <w:br/>
-      </w:r>
-      <w:r>
-        <w:rPr>
-          <w:sz w:val="18"/>
-          <w:rFonts w:ascii="Consolas" w:hAnsi="Consolas"/>
-          <w:color w:val="0969DA"/>
-        </w:rPr>
-        <w:t xml:space="preserve">+-------------------------------------------------------------------------+</w:t>
-        <w:br/>
+        <w:spacing w:line="240" w:lineRule="auto" w:before="120" w:after="60"/>
+      </w:pPr>
+      <w:r>
+        <w:drawing>
+          <wp:inline xmlns:wp="http://schemas.openxmlformats.org/drawingml/2006/wordprocessingDrawing" distT="0" distB="0" distL="0" distR="0">
+            <wp:extent cx="5486400" cy="2286000"/>
+            <wp:effectExtent l="0" t="0" r="0" b="0"/>
+            <wp:docPr id="12" name="Figure 1.2"/>
+            <wp:cNvGraphicFramePr>
+              <a:graphicFrameLocks xmlns:a="http://schemas.openxmlformats.org/drawingml/2006/main" noChangeAspect="1"/>
+            </wp:cNvGraphicFramePr>
+            <a:graphic xmlns:a="http://schemas.openxmlformats.org/drawingml/2006/main">
+              <a:graphicData uri="http://schemas.openxmlformats.org/drawingml/2006/picture">
+                <pic:pic xmlns:pic="http://schemas.openxmlformats.org/drawingml/2006/picture">
+                  <pic:nvPicPr>
+                    <pic:cNvPr id="0" name="fig_1.2.png"/>
+                    <pic:cNvPicPr/>
+                  </pic:nvPicPr>
+                  <pic:blipFill>
+                    <a:blip xmlns:r="http://schemas.openxmlformats.org/officeDocument/2006/relationships" r:embed="rIdImg1_2"/>
+                    <a:stretch>
+                      <a:fillRect/>
+                    </a:stretch>
+                  </pic:blipFill>
+                  <pic:spPr>
+                    <a:xfrm>
+                      <a:off x="0" y="0"/>
+                      <a:ext cx="5486400" cy="2286000"/>
+                    </a:xfrm>
+                    <a:prstGeom prst="rect">
+                      <a:avLst/>
+                    </a:prstGeom>
+                  </pic:spPr>
+                </pic:pic>
+              </a:graphicData>
+            </a:graphic>
+          </wp:inline>
+        </w:drawing>
       </w:r>
     </w:p>
     <w:p>

</xml_diff>